<commit_message>
Ngữ văn 12: Bài 4 (Yếu tố kì ảo trong truyện kể, T35–43), Bài 5 (Tiếng cười của hài kịch, T44–51) – KHBD, bản hoà nhập, sơ đồ tư duy, 4 bài củng cố online
Co-Authored-By: Claude Opus 5.5 <noreply@anthropic.com>
</commit_message>
<xml_diff>
--- a/mon/ngu_van/ma_tran/MaTran_DacTa_NguVan10_HK1_2026-2027.docx
+++ b/mon/ngu_van/ma_tran/MaTran_DacTa_NguVan10_HK1_2026-2027.docx
@@ -12,7 +12,7 @@
           <w:i w:val="0"/>
           <w:sz w:val="24"/>
         </w:rPr>
-        <w:t>TRƯỜNG THPTTỔ NGỮ VĂN</w:t>
+        <w:t>TRƯỜNG THPT VĨNH THẠNH – TỔ NGỮ VĂN</w:t>
       </w:r>
     </w:p>
     <w:p>
@@ -4124,11 +4124,21 @@
         </w:tc>
       </w:tr>
     </w:tbl>
+    <w:p>
+      <w:pPr>
+        <w:spacing w:before="280" w:after="40" w:line="276" w:lineRule="auto"/>
+        <w:jc w:val="center"/>
+      </w:pPr>
+      <w:r>
+        <w:rPr>
+          <w:b/>
+          <w:i w:val="0"/>
+          <w:sz w:val="24"/>
+        </w:rPr>
+        <w:t>TỔ TRƯỞNG CHUYÊN MÔN                                                                                                   NGƯỜI LẬP</w:t>
+      </w:r>
+    </w:p>
     <w:sectPr>
-      <w:headerReference w:type="default" r:id="rId9"/>
-      <w:footerReference w:type="default" r:id="rId10"/>
-      <w:headerReference w:type="first" r:id="rId11"/>
-      <w:footerReference w:type="first" r:id="rId12"/>
       <w:pgSz w:w="16838" w:h="11906" w:orient="landscape"/>
       <w:pgMar w:top="907" w:right="907" w:bottom="907" w:left="907" w:header="720" w:footer="720" w:gutter="0"/>
       <w:cols w:space="720"/>
@@ -4136,46 +4146,6 @@
     </w:sectPr>
   </w:body>
 </w:document>
-</file>
-
-<file path=word/footer1.xml><?xml version="1.0" encoding="utf-8"?>
-<w:ftr xmlns:m="http://schemas.openxmlformats.org/officeDocument/2006/math" xmlns:mc="http://schemas.openxmlformats.org/markup-compatibility/2006" xmlns:mo="http://schemas.microsoft.com/office/mac/office/2008/main" xmlns:mv="urn:schemas-microsoft-com:mac:vml" xmlns:o="urn:schemas-microsoft-com:office:office" xmlns:r="http://schemas.openxmlformats.org/officeDocument/2006/relationships" xmlns:v="urn:schemas-microsoft-com:vml" xmlns:w10="urn:schemas-microsoft-com:office:word" xmlns:w14="http://schemas.microsoft.com/office/word/2010/wordml" xmlns:w="http://schemas.openxmlformats.org/wordprocessingml/2006/main" xmlns:wne="http://schemas.microsoft.com/office/word/2006/wordml" xmlns:wp14="http://schemas.microsoft.com/office/word/2010/wordprocessingDrawing" xmlns:wp="http://schemas.openxmlformats.org/drawingml/2006/wordprocessingDrawing" xmlns:wpc="http://schemas.microsoft.com/office/word/2010/wordprocessingCanvas" xmlns:wpg="http://schemas.microsoft.com/office/word/2010/wordprocessingGroup" xmlns:wpi="http://schemas.microsoft.com/office/word/2010/wordprocessingInk" xmlns:wps="http://schemas.microsoft.com/office/word/2010/wordprocessingShape" mc:Ignorable="w14 wp14">
-  <w:p>
-    <w:pPr>
-      <w:pStyle w:val="Footer"/>
-    </w:pPr>
-  </w:p>
-</w:ftr>
-</file>
-
-<file path=word/footer2.xml><?xml version="1.0" encoding="utf-8"?>
-<w:ftr xmlns:m="http://schemas.openxmlformats.org/officeDocument/2006/math" xmlns:mc="http://schemas.openxmlformats.org/markup-compatibility/2006" xmlns:mo="http://schemas.microsoft.com/office/mac/office/2008/main" xmlns:mv="urn:schemas-microsoft-com:mac:vml" xmlns:o="urn:schemas-microsoft-com:office:office" xmlns:r="http://schemas.openxmlformats.org/officeDocument/2006/relationships" xmlns:v="urn:schemas-microsoft-com:vml" xmlns:w10="urn:schemas-microsoft-com:office:word" xmlns:w14="http://schemas.microsoft.com/office/word/2010/wordml" xmlns:w="http://schemas.openxmlformats.org/wordprocessingml/2006/main" xmlns:wne="http://schemas.microsoft.com/office/word/2006/wordml" xmlns:wp14="http://schemas.microsoft.com/office/word/2010/wordprocessingDrawing" xmlns:wp="http://schemas.openxmlformats.org/drawingml/2006/wordprocessingDrawing" xmlns:wpc="http://schemas.microsoft.com/office/word/2010/wordprocessingCanvas" xmlns:wpg="http://schemas.microsoft.com/office/word/2010/wordprocessingGroup" xmlns:wpi="http://schemas.microsoft.com/office/word/2010/wordprocessingInk" xmlns:wps="http://schemas.microsoft.com/office/word/2010/wordprocessingShape" mc:Ignorable="w14 wp14">
-  <w:p>
-    <w:pPr>
-      <w:pStyle w:val="Footer"/>
-    </w:pPr>
-  </w:p>
-</w:ftr>
-</file>
-
-<file path=word/header1.xml><?xml version="1.0" encoding="utf-8"?>
-<w:hdr xmlns:m="http://schemas.openxmlformats.org/officeDocument/2006/math" xmlns:mc="http://schemas.openxmlformats.org/markup-compatibility/2006" xmlns:mo="http://schemas.microsoft.com/office/mac/office/2008/main" xmlns:mv="urn:schemas-microsoft-com:mac:vml" xmlns:o="urn:schemas-microsoft-com:office:office" xmlns:r="http://schemas.openxmlformats.org/officeDocument/2006/relationships" xmlns:v="urn:schemas-microsoft-com:vml" xmlns:w10="urn:schemas-microsoft-com:office:word" xmlns:w14="http://schemas.microsoft.com/office/word/2010/wordml" xmlns:w="http://schemas.openxmlformats.org/wordprocessingml/2006/main" xmlns:wne="http://schemas.microsoft.com/office/word/2006/wordml" xmlns:wp14="http://schemas.microsoft.com/office/word/2010/wordprocessingDrawing" xmlns:wp="http://schemas.openxmlformats.org/drawingml/2006/wordprocessingDrawing" xmlns:wpc="http://schemas.microsoft.com/office/word/2010/wordprocessingCanvas" xmlns:wpg="http://schemas.microsoft.com/office/word/2010/wordprocessingGroup" xmlns:wpi="http://schemas.microsoft.com/office/word/2010/wordprocessingInk" xmlns:wps="http://schemas.microsoft.com/office/word/2010/wordprocessingShape" mc:Ignorable="w14 wp14">
-  <w:p>
-    <w:pPr>
-      <w:pStyle w:val="Header"/>
-    </w:pPr>
-  </w:p>
-</w:hdr>
-</file>
-
-<file path=word/header2.xml><?xml version="1.0" encoding="utf-8"?>
-<w:hdr xmlns:m="http://schemas.openxmlformats.org/officeDocument/2006/math" xmlns:mc="http://schemas.openxmlformats.org/markup-compatibility/2006" xmlns:mo="http://schemas.microsoft.com/office/mac/office/2008/main" xmlns:mv="urn:schemas-microsoft-com:mac:vml" xmlns:o="urn:schemas-microsoft-com:office:office" xmlns:r="http://schemas.openxmlformats.org/officeDocument/2006/relationships" xmlns:v="urn:schemas-microsoft-com:vml" xmlns:w10="urn:schemas-microsoft-com:office:word" xmlns:w14="http://schemas.microsoft.com/office/word/2010/wordml" xmlns:w="http://schemas.openxmlformats.org/wordprocessingml/2006/main" xmlns:wne="http://schemas.microsoft.com/office/word/2006/wordml" xmlns:wp14="http://schemas.microsoft.com/office/word/2010/wordprocessingDrawing" xmlns:wp="http://schemas.openxmlformats.org/drawingml/2006/wordprocessingDrawing" xmlns:wpc="http://schemas.microsoft.com/office/word/2010/wordprocessingCanvas" xmlns:wpg="http://schemas.microsoft.com/office/word/2010/wordprocessingGroup" xmlns:wpi="http://schemas.microsoft.com/office/word/2010/wordprocessingInk" xmlns:wps="http://schemas.microsoft.com/office/word/2010/wordprocessingShape" mc:Ignorable="w14 wp14">
-  <w:p>
-    <w:pPr>
-      <w:pStyle w:val="Header"/>
-    </w:pPr>
-  </w:p>
-</w:hdr>
 </file>
 
 <file path=word/numbering.xml><?xml version="1.0" encoding="utf-8"?>

</xml_diff>